<commit_message>
Supabase auth, firm profiles, form fixes
</commit_message>
<xml_diff>
--- a/templates/form_1_template.docx
+++ b/templates/form_1_template.docx
@@ -1552,19 +1552,10 @@
             <w:vAlign w:val="center"/>
           </w:tcPr>
           <w:p>
-            <w:pPr>
-              <w:ind w:left="141"/>
-              <w:rPr>
-                <w:rFonts w:eastAsia="Calibri"/>
-                <w:sz w:val="22"/>
-                <w:szCs w:val="22"/>
-              </w:rPr>
-            </w:pPr>
-            <w:r>
-              <w:rPr>
-                <w:rFonts w:eastAsia="Calibri"/>
-                <w:sz w:val="22"/>
-                <w:szCs w:val="22"/>
+            <w:r>
+              <w:rPr>
+                <w:rFonts w:ascii="Times New Roman" w:hAnsi="Times New Roman"/>
+                <w:sz w:val="22"/>
               </w:rPr>
               <w:t>{firm_email}</w:t>
             </w:r>
@@ -1739,27 +1730,12 @@
             <w:vAlign w:val="center"/>
           </w:tcPr>
           <w:p>
-            <w:pPr>
-              <w:widowControl w:val="0"/>
-              <w:autoSpaceDE w:val="0"/>
-              <w:autoSpaceDN w:val="0"/>
-              <w:adjustRightInd w:val="0"/>
-              <w:spacing w:before="33"/>
-              <w:ind w:left="141"/>
-              <w:rPr>
-                <w:rFonts w:eastAsia="Calibri"/>
-                <w:position w:val="-1"/>
-                <w:sz w:val="22"/>
-                <w:szCs w:val="22"/>
-              </w:rPr>
-            </w:pPr>
-            <w:r>
-              <w:rPr>
-                <w:rFonts w:eastAsia="Calibri"/>
-                <w:position w:val="-1"/>
-                <w:sz w:val="22"/>
-                <w:szCs w:val="22"/>
-              </w:rPr>
+            <w:r>
+              <w:rPr>
+                <w:rFonts w:ascii="Times New Roman" w:hAnsi="Times New Roman"/>
+                <w:sz w:val="22"/>
+              </w:rPr>
+              <w:t>{agent_mobile}</w:t>
             </w:r>
           </w:p>
         </w:tc>
@@ -3233,7 +3209,6 @@
                 <w:sz w:val="22"/>
                 <w:szCs w:val="22"/>
               </w:rPr>
-              <w:t xml:space="preserve">Meenakshi </w:t>
             </w:r>
           </w:p>
         </w:tc>
@@ -4655,7 +4630,6 @@
                 <w:sz w:val="22"/>
                 <w:szCs w:val="22"/>
               </w:rPr>
-              <w:t xml:space="preserve">MITA N SHEIKH </w:t>
             </w:r>
           </w:p>
         </w:tc>
@@ -5012,7 +4986,6 @@
                 <w:sz w:val="22"/>
                 <w:szCs w:val="22"/>
               </w:rPr>
-              <w:t>Dhakshina</w:t>
             </w:r>
             <w:proofErr w:type="spellEnd"/>
             <w:r>
@@ -5020,7 +4993,6 @@
                 <w:sz w:val="22"/>
                 <w:szCs w:val="22"/>
               </w:rPr>
-              <w:t xml:space="preserve"> Moorthy C</w:t>
             </w:r>
           </w:p>
         </w:tc>
@@ -5376,7 +5348,6 @@
                 <w:sz w:val="22"/>
                 <w:szCs w:val="22"/>
               </w:rPr>
-              <w:t>Shashi Kant Verma</w:t>
             </w:r>
           </w:p>
         </w:tc>
@@ -5735,7 +5706,6 @@
                 <w:szCs w:val="22"/>
                 <w:shd w:val="clear" w:color="auto" w:fill="FFFFFF"/>
               </w:rPr>
-              <w:t>Dr. Padmapriya V.</w:t>
             </w:r>
           </w:p>
         </w:tc>
@@ -7181,14 +7151,12 @@
                 <w:color w:val="222222"/>
                 <w:shd w:val="clear" w:color="auto" w:fill="FFFFFF"/>
               </w:rPr>
-              <w:t>Priya</w:t>
             </w:r>
             <w:r>
               <w:rPr>
                 <w:color w:val="222222"/>
                 <w:shd w:val="clear" w:color="auto" w:fill="FFFFFF"/>
               </w:rPr>
-              <w:t> </w:t>
             </w:r>
             <w:r>
               <w:rPr>
@@ -7197,7 +7165,6 @@
                 <w:color w:val="222222"/>
                 <w:shd w:val="clear" w:color="auto" w:fill="FFFFFF"/>
               </w:rPr>
-              <w:t>Chauhan</w:t>
             </w:r>
           </w:p>
         </w:tc>
@@ -7923,30 +7890,12 @@
             <w:vAlign w:val="center"/>
           </w:tcPr>
           <w:p>
-            <w:pPr>
-              <w:widowControl w:val="0"/>
-              <w:autoSpaceDE w:val="0"/>
-              <w:autoSpaceDN w:val="0"/>
-              <w:adjustRightInd w:val="0"/>
-              <w:spacing w:before="33"/>
-              <w:ind w:left="336" w:hanging="227"/>
-              <w:rPr>
-                <w:rFonts w:eastAsia="Calibri"/>
-                <w:b/>
-                <w:bCs/>
-                <w:position w:val="-1"/>
-                <w:sz w:val="22"/>
-                <w:szCs w:val="22"/>
-                <w:highlight w:val="yellow"/>
-              </w:rPr>
-            </w:pPr>
-            <w:r>
-              <w:rPr>
-                <w:rFonts w:eastAsia="Calibri"/>
-                <w:sz w:val="22"/>
-                <w:szCs w:val="22"/>
-                <w:lang w:val="pt-BR"/>
-              </w:rPr>
+            <w:r>
+              <w:rPr>
+                <w:rFonts w:ascii="Times New Roman" w:hAnsi="Times New Roman"/>
+                <w:sz w:val="22"/>
+              </w:rPr>
+              <w:t>{agent_mobile}</w:t>
             </w:r>
           </w:p>
         </w:tc>
@@ -8191,58 +8140,13 @@
             <w:vAlign w:val="center"/>
           </w:tcPr>
           <w:p>
-            <w:pPr>
-              <w:spacing w:line="360" w:lineRule="auto"/>
-              <w:rPr>
-                <w:rFonts w:eastAsia="Calibri"/>
-                <w:sz w:val="22"/>
-                <w:szCs w:val="22"/>
-                <w:lang w:val="pt-BR"/>
-              </w:rPr>
-            </w:pPr>
-            <w:hyperlink r:id="rId8" w:history="1">
-              <w:r>
-                <w:rPr>
-                  <w:rStyle w:val="Hyperlink"/>
-                  <w:rFonts w:eastAsia="Calibri"/>
-                  <w:color w:val="auto"/>
-                  <w:sz w:val="22"/>
-                  <w:szCs w:val="22"/>
-                  <w:lang w:val="pt-BR"/>
-                </w:rPr>
-                <w:t>{firm_email}</w:t>
-              </w:r>
-            </w:hyperlink>
-            <w:r>
+            <w:r>
+              <w:rPr>
+                <w:rFonts w:ascii="Times New Roman" w:hAnsi="Times New Roman"/>
+                <w:sz w:val="20"/>
+              </w:rPr>
               <w:t>{firm_email}</w:t>
             </w:r>
-          </w:p>
-          <w:p>
-            <w:pPr>
-              <w:spacing w:line="360" w:lineRule="auto"/>
-              <w:rPr>
-                <w:rFonts w:eastAsia="Calibri"/>
-                <w:b/>
-                <w:bCs/>
-                <w:position w:val="-1"/>
-                <w:sz w:val="22"/>
-                <w:szCs w:val="22"/>
-                <w:highlight w:val="yellow"/>
-              </w:rPr>
-            </w:pPr>
-            <w:hyperlink r:id="rId9" w:history="1">
-              <w:r>
-                <w:rPr>
-                  <w:rStyle w:val="Hyperlink"/>
-                  <w:rFonts w:eastAsia="Calibri"/>
-                  <w:color w:val="auto"/>
-                  <w:sz w:val="22"/>
-                  <w:szCs w:val="22"/>
-                  <w:lang w:val="pt-BR"/>
-                </w:rPr>
-                <w:t>{firm_email}</w:t>
-              </w:r>
-            </w:hyperlink>
           </w:p>
         </w:tc>
       </w:tr>

</xml_diff>